<commit_message>
Made some changes to the reregister button
</commit_message>
<xml_diff>
--- a/BUSINESS PLAN FOR STACKAIV TELEGRAM BOT.docx
+++ b/BUSINESS PLAN FOR STACKAIV TELEGRAM BOT.docx
@@ -1661,27 +1661,7 @@
           <w:szCs w:val="28"/>
           <w:lang w:val="en-GB"/>
         </w:rPr>
-        <w:t xml:space="preserve">Use all to get all the resources, both notes, </w:t>
-      </w:r>
-      <w:proofErr w:type="spellStart"/>
-      <w:r>
-        <w:rPr>
-          <w:rFonts w:ascii="Sitka Display" w:hAnsi="Sitka Display" w:cs="Times New Roman"/>
-          <w:sz w:val="28"/>
-          <w:szCs w:val="28"/>
-          <w:lang w:val="en-GB"/>
-        </w:rPr>
-        <w:t>pqfiles</w:t>
-      </w:r>
-      <w:proofErr w:type="spellEnd"/>
-      <w:r>
-        <w:rPr>
-          <w:rFonts w:ascii="Sitka Display" w:hAnsi="Sitka Display" w:cs="Times New Roman"/>
-          <w:sz w:val="28"/>
-          <w:szCs w:val="28"/>
-          <w:lang w:val="en-GB"/>
-        </w:rPr>
-        <w:t xml:space="preserve"> etc</w:t>
+        <w:t>Use all to get all the resources, both notes, pqfiles etc</w:t>
       </w:r>
     </w:p>
     <w:p>
@@ -1935,16 +1915,16 @@
           <w:szCs w:val="28"/>
           <w:lang w:val="en-GB"/>
         </w:rPr>
-        <w:t xml:space="preserve"> – A </w:t>
-      </w:r>
-      <w:r>
-        <w:rPr>
-          <w:rFonts w:ascii="Sitka Display" w:hAnsi="Sitka Display" w:cs="Times New Roman"/>
-          <w:sz w:val="28"/>
-          <w:szCs w:val="28"/>
-          <w:lang w:val="en-GB"/>
-        </w:rPr>
-        <w:t>S logo</w:t>
+        <w:t xml:space="preserve"> – </w:t>
+      </w:r>
+      <w:r>
+        <w:rPr>
+          <w:rFonts w:ascii="Sitka Display" w:hAnsi="Sitka Display" w:cs="Times New Roman"/>
+          <w:sz w:val="28"/>
+          <w:szCs w:val="28"/>
+          <w:lang w:val="en-GB"/>
+        </w:rPr>
+        <w:t>(Still under review)</w:t>
       </w:r>
     </w:p>
     <w:p>
@@ -1980,7 +1960,16 @@
           <w:szCs w:val="28"/>
           <w:lang w:val="en-GB"/>
         </w:rPr>
-        <w:t xml:space="preserve"> – Light blue and Teal</w:t>
+        <w:t xml:space="preserve"> – </w:t>
+      </w:r>
+      <w:r>
+        <w:rPr>
+          <w:rFonts w:ascii="Sitka Display" w:hAnsi="Sitka Display" w:cs="Times New Roman"/>
+          <w:sz w:val="28"/>
+          <w:szCs w:val="28"/>
+          <w:lang w:val="en-GB"/>
+        </w:rPr>
+        <w:t>(Still under review)</w:t>
       </w:r>
     </w:p>
     <w:p>

</xml_diff>